<commit_message>
Kim12-3-2-Biyobozunur-Polimerler: gorsel alanlarina Shutter onizlemeleri yerlestirildi (2.3 bicimi)
</commit_message>
<xml_diff>
--- a/Kim12-3-2-Biyobozunur-Polimerler.docx
+++ b/Kim12-3-2-Biyobozunur-Polimerler.docx
@@ -39,99 +39,73 @@
         <w:t xml:space="preserve">Bir portakal ya da mandalina soyduğunuzda kabuğun iç yüzünde beyaz, süngerimsi bir tabaka görürsünüz (Görsel A). Bu tabakada bulunan pektin, reçel ve marmelatların kıvam kazanmasını sağlayan bir maddedir. Markette aldığınız bazı çatal-bıçak takımlarının, bardakların ya da poşetlerin üzerinde ise “kompostlanabilir” ya da “doğada çözünür” gibi ifadeler yer alır (Görsel B). Bir muz kabuğu toprakta birkaç hafta içinde çürüyüp kaybolurken sıradan bir plastik poşet uzun yıllar boyunca neredeyse hiç değişmeden kalabilir. Peki, meyve kabuklarından, nişastadan ya da jelatinden plastik gibi kullanılabilen bir malzeme üretilebilir mi? Esnek bir ambalaj filmi, sert bir fide kabı ya da suda kısa sürede dağılan bir tohum bandı elde etmek için hangi bileşenleri seçmek gerekir? Bu soruların cevabını bir etkinlik yaparak keşfediniz. Analiz ve Keşif Atölyesi 3.2.’de karar vereceksiniz: Elde etmek istediğiniz biyobozunur polimer için bir amaç belirleyecek, bu amaca uygun bilgi toplayacak, bileşenler için seçenekler oluşturacak, seçeneklerinizi mantıksal olarak denetleyecek, seçiminizi yapıp polimerinizi elde edecek ve ulaştığınız sonuç üzerinde yansıtma yapacaksınız. Bu süreçte araştırmacı ve çalışkan bir tutumla güvenilir bilgiye ulaşacak, işler planladığınız gibi gitmediğinde farklı seçenekler deneyerek esneklik gösterecek ve kendi öğrenme sürecinizi düzenleyeceksiniz.</w:t>
       </w:r>
     </w:p>
-    <w:tbl>
-      <w:tblPr>
-        <w:tblW w:w="9000" w:type="dxa"/>
+    <w:p>
+      <w:pPr>
         <w:jc w:val="center"/>
-        <w:tblBorders>
-          <w:top w:val="single" w:sz="8" w:space="0" w:color="7F7F7F"/>
-          <w:left w:val="single" w:sz="8" w:space="0" w:color="7F7F7F"/>
-          <w:bottom w:val="single" w:sz="8" w:space="0" w:color="7F7F7F"/>
-          <w:right w:val="single" w:sz="8" w:space="0" w:color="7F7F7F"/>
-        </w:tblBorders>
-      </w:tblPr>
-      <w:tblGrid>
-        <w:gridCol w:w="9000"/>
-      </w:tblGrid>
-      <w:tr>
-        <w:tc>
-          <w:tcPr>
-            <w:tcW w:w="9000" w:type="dxa"/>
-            <w:shd w:val="clear" w:color="auto" w:fill="EDEDED"/>
-          </w:tcPr>
-          <w:p>
-            <w:pPr>
-              <w:jc w:val="both"/>
-              <w:rPr>
-                <w:rFonts w:ascii="Times New Roman" w:hAnsi="Times New Roman" w:cs="Times New Roman"/>
-                <w:lang w:val="tr-TR"/>
-              </w:rPr>
-            </w:pPr>
-            <w:r>
-              <w:rPr>
-                <w:rFonts w:ascii="Times New Roman" w:hAnsi="Times New Roman" w:cs="Times New Roman"/>
-                <w:lang w:val="tr-TR"/>
-              </w:rPr>
-              <w:t xml:space="preserve">GÖRSEL ALANI (Shutterstock)</w:t>
-            </w:r>
-          </w:p>
-          <w:p>
-            <w:pPr>
-              <w:jc w:val="both"/>
-              <w:rPr>
-                <w:rFonts w:ascii="Times New Roman" w:hAnsi="Times New Roman" w:cs="Times New Roman"/>
-                <w:lang w:val="tr-TR"/>
-              </w:rPr>
-            </w:pPr>
-            <w:r>
-              <w:rPr>
-                <w:rFonts w:ascii="Times New Roman" w:hAnsi="Times New Roman" w:cs="Times New Roman"/>
-                <w:lang w:val="tr-TR"/>
-              </w:rPr>
-              <w:t xml:space="preserve">Tarif: Yarısı soyulmuş bir portakal ya da mandalina; kabuğun iç yüzündeki beyaz süngerimsi tabaka yakın çekimde görünsün.</w:t>
-            </w:r>
-          </w:p>
-          <w:p>
-            <w:pPr>
-              <w:jc w:val="both"/>
-              <w:rPr>
-                <w:rFonts w:ascii="Times New Roman" w:hAnsi="Times New Roman" w:cs="Times New Roman"/>
-                <w:lang w:val="tr-TR"/>
-              </w:rPr>
-            </w:pPr>
-            <w:r>
-              <w:rPr>
-                <w:rFonts w:ascii="Times New Roman" w:hAnsi="Times New Roman" w:cs="Times New Roman"/>
-                <w:lang w:val="tr-TR"/>
-              </w:rPr>
-              <w:t xml:space="preserve">Shutter ID: 1953876646 (fotoğraf) — Close-up of freshly peeled orange peel</w:t>
-            </w:r>
-          </w:p>
-        </w:tc>
-      </w:tr>
-    </w:tbl>
-    <w:p>
-      <w:pPr>
-        <w:jc w:val="both"/>
-        <w:rPr>
-          <w:rFonts w:ascii="Times New Roman" w:hAnsi="Times New Roman" w:cs="Times New Roman"/>
-          <w:lang w:val="tr-TR"/>
-        </w:rPr>
-      </w:pPr>
+      </w:pPr>
+      <w:r>
+        <w:drawing>
+          <wp:inline xmlns:a="http://schemas.openxmlformats.org/drawingml/2006/main" xmlns:pic="http://schemas.openxmlformats.org/drawingml/2006/picture">
+            <wp:extent cx="3085714" cy="2520000"/>
+            <wp:docPr id="900013" name="Picture 900013"/>
+            <wp:cNvGraphicFramePr>
+              <a:graphicFrameLocks noChangeAspect="1"/>
+            </wp:cNvGraphicFramePr>
+            <a:graphic>
+              <a:graphicData uri="http://schemas.openxmlformats.org/drawingml/2006/picture">
+                <pic:pic>
+                  <pic:nvPicPr>
+                    <pic:cNvPr id="0" name="1953876646_d.jpg"/>
+                    <pic:cNvPicPr/>
+                  </pic:nvPicPr>
+                  <pic:blipFill>
+                    <a:blip r:embed="rId11"/>
+                    <a:stretch>
+                      <a:fillRect/>
+                    </a:stretch>
+                  </pic:blipFill>
+                  <pic:spPr>
+                    <a:xfrm>
+                      <a:off x="0" y="0"/>
+                      <a:ext cx="3085714" cy="2520000"/>
+                    </a:xfrm>
+                    <a:prstGeom prst="rect"/>
+                  </pic:spPr>
+                </pic:pic>
+              </a:graphicData>
+            </a:graphic>
+          </wp:inline>
+        </w:drawing>
+      </w:r>
     </w:p>
     <w:p>
       <w:pPr>
         <w:jc w:val="center"/>
-        <w:rPr>
-          <w:rFonts w:ascii="Times New Roman" w:hAnsi="Times New Roman" w:cs="Times New Roman"/>
-          <w:lang w:val="tr-TR"/>
-        </w:rPr>
       </w:pPr>
       <w:r>
         <w:rPr>
           <w:rFonts w:ascii="Times New Roman" w:hAnsi="Times New Roman" w:cs="Times New Roman"/>
           <w:b/>
           <w:bCs/>
+          <w:highlight w:val="yellow"/>
+          <w:lang w:val="tr-TR"/>
+        </w:rPr>
+        <w:t xml:space="preserve">Shutter id: 1953876646</w:t>
+      </w:r>
+    </w:p>
+    <w:p>
+      <w:pPr>
+        <w:jc w:val="center"/>
+        <w:rPr>
+          <w:rFonts w:ascii="Times New Roman" w:hAnsi="Times New Roman" w:cs="Times New Roman"/>
+          <w:lang w:val="tr-TR"/>
+        </w:rPr>
+      </w:pPr>
+      <w:r>
+        <w:rPr>
+          <w:rFonts w:ascii="Times New Roman" w:hAnsi="Times New Roman" w:cs="Times New Roman"/>
+          <w:b/>
+          <w:bCs/>
           <w:lang w:val="tr-TR"/>
         </w:rPr>
         <w:t xml:space="preserve">Görsel A:</w:t>
@@ -144,85 +118,59 @@
         <w:t xml:space="preserve"> Turunçgil kabuğunun iç yüzü</w:t>
       </w:r>
     </w:p>
-    <w:tbl>
-      <w:tblPr>
-        <w:tblW w:w="9000" w:type="dxa"/>
+    <w:p>
+      <w:pPr>
         <w:jc w:val="center"/>
-        <w:tblBorders>
-          <w:top w:val="single" w:sz="8" w:space="0" w:color="7F7F7F"/>
-          <w:left w:val="single" w:sz="8" w:space="0" w:color="7F7F7F"/>
-          <w:bottom w:val="single" w:sz="8" w:space="0" w:color="7F7F7F"/>
-          <w:right w:val="single" w:sz="8" w:space="0" w:color="7F7F7F"/>
-        </w:tblBorders>
-      </w:tblPr>
-      <w:tblGrid>
-        <w:gridCol w:w="9000"/>
-      </w:tblGrid>
-      <w:tr>
-        <w:tc>
-          <w:tcPr>
-            <w:tcW w:w="9000" w:type="dxa"/>
-            <w:shd w:val="clear" w:color="auto" w:fill="EDEDED"/>
-          </w:tcPr>
-          <w:p>
-            <w:pPr>
-              <w:jc w:val="both"/>
-              <w:rPr>
-                <w:rFonts w:ascii="Times New Roman" w:hAnsi="Times New Roman" w:cs="Times New Roman"/>
-                <w:lang w:val="tr-TR"/>
-              </w:rPr>
-            </w:pPr>
-            <w:r>
-              <w:rPr>
-                <w:rFonts w:ascii="Times New Roman" w:hAnsi="Times New Roman" w:cs="Times New Roman"/>
-                <w:lang w:val="tr-TR"/>
-              </w:rPr>
-              <w:t xml:space="preserve">GÖRSEL ALANI (Shutterstock)</w:t>
-            </w:r>
-          </w:p>
-          <w:p>
-            <w:pPr>
-              <w:jc w:val="both"/>
-              <w:rPr>
-                <w:rFonts w:ascii="Times New Roman" w:hAnsi="Times New Roman" w:cs="Times New Roman"/>
-                <w:lang w:val="tr-TR"/>
-              </w:rPr>
-            </w:pPr>
-            <w:r>
-              <w:rPr>
-                <w:rFonts w:ascii="Times New Roman" w:hAnsi="Times New Roman" w:cs="Times New Roman"/>
-                <w:lang w:val="tr-TR"/>
-              </w:rPr>
-              <w:t xml:space="preserve">Tarif: Bitkisel kaynaklı biyobozunur çatal, kaşık, bardak ve poşetler ile yanlarında kompost toprağı (marka/logo görünmesin).</w:t>
-            </w:r>
-          </w:p>
-          <w:p>
-            <w:pPr>
-              <w:jc w:val="both"/>
-              <w:rPr>
-                <w:rFonts w:ascii="Times New Roman" w:hAnsi="Times New Roman" w:cs="Times New Roman"/>
-                <w:lang w:val="tr-TR"/>
-              </w:rPr>
-            </w:pPr>
-            <w:r>
-              <w:rPr>
-                <w:rFonts w:ascii="Times New Roman" w:hAnsi="Times New Roman" w:cs="Times New Roman"/>
-                <w:lang w:val="tr-TR"/>
-              </w:rPr>
-              <w:t xml:space="preserve">Shutter ID: 2524511939 (fotoğraf) — Eco-friendly biodegradable disposable tableware</w:t>
-            </w:r>
-          </w:p>
-        </w:tc>
-      </w:tr>
-    </w:tbl>
-    <w:p>
-      <w:pPr>
-        <w:jc w:val="both"/>
-        <w:rPr>
-          <w:rFonts w:ascii="Times New Roman" w:hAnsi="Times New Roman" w:cs="Times New Roman"/>
-          <w:lang w:val="tr-TR"/>
-        </w:rPr>
-      </w:pPr>
+      </w:pPr>
+      <w:r>
+        <w:drawing>
+          <wp:inline xmlns:a="http://schemas.openxmlformats.org/drawingml/2006/main" xmlns:pic="http://schemas.openxmlformats.org/drawingml/2006/picture">
+            <wp:extent cx="3436363" cy="2520000"/>
+            <wp:docPr id="900014" name="Picture 900014"/>
+            <wp:cNvGraphicFramePr>
+              <a:graphicFrameLocks noChangeAspect="1"/>
+            </wp:cNvGraphicFramePr>
+            <a:graphic>
+              <a:graphicData uri="http://schemas.openxmlformats.org/drawingml/2006/picture">
+                <pic:pic>
+                  <pic:nvPicPr>
+                    <pic:cNvPr id="0" name="2524511939_d.jpg"/>
+                    <pic:cNvPicPr/>
+                  </pic:nvPicPr>
+                  <pic:blipFill>
+                    <a:blip r:embed="rId12"/>
+                    <a:stretch>
+                      <a:fillRect/>
+                    </a:stretch>
+                  </pic:blipFill>
+                  <pic:spPr>
+                    <a:xfrm>
+                      <a:off x="0" y="0"/>
+                      <a:ext cx="3436363" cy="2520000"/>
+                    </a:xfrm>
+                    <a:prstGeom prst="rect"/>
+                  </pic:spPr>
+                </pic:pic>
+              </a:graphicData>
+            </a:graphic>
+          </wp:inline>
+        </w:drawing>
+      </w:r>
+    </w:p>
+    <w:p>
+      <w:pPr>
+        <w:jc w:val="center"/>
+      </w:pPr>
+      <w:r>
+        <w:rPr>
+          <w:rFonts w:ascii="Times New Roman" w:hAnsi="Times New Roman" w:cs="Times New Roman"/>
+          <w:b/>
+          <w:bCs/>
+          <w:highlight w:val="yellow"/>
+          <w:lang w:val="tr-TR"/>
+        </w:rPr>
+        <w:t xml:space="preserve">Shutter id: 2524511939</w:t>
+      </w:r>
     </w:p>
     <w:p>
       <w:pPr>

</xml_diff>